<commit_message>
Síntese do Relatório 2: fonte para o preço do sachê de hotel e a data de fundação da Estoril
Co-Authored-By: Claude Opus 5.5 <noreply@anthropic.com>
Claude-Session: https://claude.ai/code/session_014VpYYBWAWP858VZtSC21wh
</commit_message>
<xml_diff>
--- a/entregaveis/Síntese da Análise de Concorrentes (para o Relatório 2).docx
+++ b/entregaveis/Síntese da Análise de Concorrentes (para o Relatório 2).docx
@@ -69,7 +69,7 @@
         </w:rPr>
         <w:t xml:space="preserve">Nenhuma marca vende no Brasil shampoo e condicionador premium em dose única para a consumidora final. O sachê de um banho, porém, é vendido a hotéis por centavos: o par de 30 ml sai por cerca de R$ 0,94 na H MAX, segundo o orçamento que recebemos como cliente oculto, e por cerca de R$ 2,43 na Naturys Eco, comprada em pacotes de </w:t>
       </w:r>
-      <w:hyperlink w:history="1" r:id="rIdijgunmn5ehbyexrkreu2c">
+      <w:hyperlink w:history="1" r:id="rIdt_qdqplkz0nekaci3hl0w">
         <w:r>
           <w:rPr>
             <w:rFonts w:ascii="Montserrat" w:cs="Montserrat" w:eastAsia="Montserrat" w:hAnsi="Montserrat"/>
@@ -162,7 +162,7 @@
         </w:rPr>
         <w:t xml:space="preserve">A cliente vai comparar o kit com três referências: o sachê de hotel, de R$ 0,94 a R$ 2,43 o par; a </w:t>
       </w:r>
-      <w:hyperlink w:history="1" r:id="rIdgilafpwrydzfsfdvvpuau">
+      <w:hyperlink w:history="1" r:id="rIdnnjkd9aqp-7zdzqrlmajl">
         <w:r>
           <w:rPr>
             <w:rFonts w:ascii="Montserrat" w:cs="Montserrat" w:eastAsia="Montserrat" w:hAnsi="Montserrat"/>
@@ -187,7 +187,7 @@
         </w:rPr>
         <w:t xml:space="preserve">, cerca de R$ 19,98 por 30 ml de shampoo e de condicionador; e o </w:t>
       </w:r>
-      <w:hyperlink w:history="1" r:id="rIddwwtadl40zgyaruz0qo48">
+      <w:hyperlink w:history="1" r:id="rIdoqf_gpmajnjue8yj-k3h4">
         <w:r>
           <w:rPr>
             <w:rFonts w:ascii="Montserrat" w:cs="Montserrat" w:eastAsia="Montserrat" w:hAnsi="Montserrat"/>
@@ -212,7 +212,7 @@
         </w:rPr>
         <w:t xml:space="preserve">, de R$ 27,39. Entre o sachê e o kit de viagem existe uma faixa de preço vazia. O substituto mais barato é o </w:t>
       </w:r>
-      <w:hyperlink w:history="1" r:id="rIdpxckpz7hnyk4jpxfgw0vz">
+      <w:hyperlink w:history="1" r:id="rId3nb_75iirjkucls7xq6ir">
         <w:r>
           <w:rPr>
             <w:rFonts w:ascii="Montserrat" w:cs="Montserrat" w:eastAsia="Montserrat" w:hAnsi="Montserrat"/>
@@ -269,7 +269,57 @@
           <w:sz w:val="20"/>
           <w:szCs w:val="20"/>
         </w:rPr>
-        <w:t xml:space="preserve">H MAX e Estoril atendem hotéis há mais de 20 anos, com preço de fábrica abaixo de R$ 1 por sachê, e a H MAX ainda responde rápido e oferece amostra grátis. A WEEK dificilmente entra nesse canal competindo por preço. Por isso o B2B entra no lançamento como piloto, com poucas academias ou hotéis, e não como canal principal. É no consumidor final que a WEEK encontra o caminho livre.</w:t>
+        <w:t xml:space="preserve">Hotéis já compram sachê por menos de R$ 1 a unidade, como o da Naturallys, linha da H MAX, a R$ 0,25 na </w:t>
+      </w:r>
+      <w:hyperlink w:history="1" r:id="rIdosrszr5dbtmaj__ei4i0i">
+        <w:r>
+          <w:rPr>
+            <w:rFonts w:ascii="Montserrat" w:cs="Montserrat" w:eastAsia="Montserrat" w:hAnsi="Montserrat"/>
+            <w:b w:val="false"/>
+            <w:bCs w:val="false"/>
+            <w:color w:val="315CB6"/>
+            <w:sz w:val="20"/>
+            <w:szCs w:val="20"/>
+            <w:u w:val="single"/>
+          </w:rPr>
+          <w:t xml:space="preserve">ParaHotel</w:t>
+        </w:r>
+      </w:hyperlink>
+      <w:r>
+        <w:rPr>
+          <w:rFonts w:ascii="Montserrat" w:cs="Montserrat" w:eastAsia="Montserrat" w:hAnsi="Montserrat"/>
+          <w:b w:val="false"/>
+          <w:bCs w:val="false"/>
+          <w:color w:val="262626"/>
+          <w:sz w:val="20"/>
+          <w:szCs w:val="20"/>
+        </w:rPr>
+        <w:t xml:space="preserve">. Quem fornece são fábricas com escala e tradição, como a Estoril, </w:t>
+      </w:r>
+      <w:hyperlink w:history="1" r:id="rIdy5dbvp152xokzfdzyksnb">
+        <w:r>
+          <w:rPr>
+            <w:rFonts w:ascii="Montserrat" w:cs="Montserrat" w:eastAsia="Montserrat" w:hAnsi="Montserrat"/>
+            <w:b w:val="false"/>
+            <w:bCs w:val="false"/>
+            <w:color w:val="315CB6"/>
+            <w:sz w:val="20"/>
+            <w:szCs w:val="20"/>
+            <w:u w:val="single"/>
+          </w:rPr>
+          <w:t xml:space="preserve">aberta em 1983</w:t>
+        </w:r>
+      </w:hyperlink>
+      <w:r>
+        <w:rPr>
+          <w:rFonts w:ascii="Montserrat" w:cs="Montserrat" w:eastAsia="Montserrat" w:hAnsi="Montserrat"/>
+          <w:b w:val="false"/>
+          <w:bCs w:val="false"/>
+          <w:color w:val="262626"/>
+          <w:sz w:val="20"/>
+          <w:szCs w:val="20"/>
+        </w:rPr>
+        <w:t xml:space="preserve">, e a H MAX, no nosso contato como cliente oculto, respondeu rápido e ofereceu amostra grátis. A WEEK dificilmente entra nesse canal competindo por preço. Por isso o B2B entra no lançamento como piloto, com poucas academias ou hotéis, e não como canal principal. É no consumidor final que a WEEK encontra o caminho livre.</w:t>
       </w:r>
     </w:p>
     <w:p>
@@ -718,7 +768,7 @@
         </w:rPr>
         <w:t xml:space="preserve"> O selo eureciclo que a Naturys Eco usa comprova a compensação da embalagem, e não que ela seja biodegradável, segundo o </w:t>
       </w:r>
-      <w:hyperlink w:history="1" r:id="rIdlnsqmuozeh35ggtzgcif-">
+      <w:hyperlink w:history="1" r:id="rIdwztbn-wxrcmjgexh7opun">
         <w:r>
           <w:rPr>
             <w:rFonts w:ascii="Montserrat" w:cs="Montserrat" w:eastAsia="Montserrat" w:hAnsi="Montserrat"/>
@@ -775,7 +825,7 @@
         </w:rPr>
         <w:t xml:space="preserve"> Compradores da Naturys Eco no </w:t>
       </w:r>
-      <w:hyperlink w:history="1" r:id="rIdu_9dfx5wdbe3kimwih80u">
+      <w:hyperlink w:history="1" r:id="rIds5izzlehtgi4wcnf46dlf">
         <w:r>
           <w:rPr>
             <w:rFonts w:ascii="Montserrat" w:cs="Montserrat" w:eastAsia="Montserrat" w:hAnsi="Montserrat"/>
@@ -848,7 +898,7 @@
         </w:rPr>
         <w:t xml:space="preserve">A ordem e o prazo de cada passo estão no </w:t>
       </w:r>
-      <w:hyperlink w:history="1" r:id="rIdllikasvzyuvvuwufbcq66">
+      <w:hyperlink w:history="1" r:id="rIdtcy6x2lgzw3rzrnksd4dh">
         <w:r>
           <w:rPr>
             <w:rFonts w:ascii="Montserrat" w:cs="Montserrat" w:eastAsia="Montserrat" w:hAnsi="Montserrat"/>
@@ -1449,7 +1499,7 @@
               </w:rPr>
               <w:t xml:space="preserve">Compradores da Naturys Eco no </w:t>
             </w:r>
-            <w:hyperlink w:history="1" r:id="rId7qffmu6t0glfncjwr31ig">
+            <w:hyperlink w:history="1" r:id="rIdvnqe0lesxx35bsfzofjqx">
               <w:r>
                 <w:rPr>
                   <w:rFonts w:ascii="Montserrat" w:cs="Montserrat" w:eastAsia="Montserrat" w:hAnsi="Montserrat"/>
@@ -1582,7 +1632,7 @@
               </w:rPr>
               <w:t xml:space="preserve">A Squeeze Pod, de dose única, recebe </w:t>
             </w:r>
-            <w:hyperlink w:history="1" r:id="rIdnt1kvkhppxkbuoxet4vky">
+            <w:hyperlink w:history="1" r:id="rIdchqipdfzn-zkzrbycjhxr">
               <w:r>
                 <w:rPr>
                   <w:rFonts w:ascii="Montserrat" w:cs="Montserrat" w:eastAsia="Montserrat" w:hAnsi="Montserrat"/>
@@ -1715,7 +1765,7 @@
               </w:rPr>
               <w:t xml:space="preserve">Estoril e H MAX já fabricam sachê de 30 ml no país. A Estoril pede </w:t>
             </w:r>
-            <w:hyperlink w:history="1" r:id="rIdhabkxqea63n75ywmq9av3">
+            <w:hyperlink w:history="1" r:id="rId5klylixg6tgqlur9ptzet">
               <w:r>
                 <w:rPr>
                   <w:rFonts w:ascii="Montserrat" w:cs="Montserrat" w:eastAsia="Montserrat" w:hAnsi="Montserrat"/>
@@ -1837,7 +1887,7 @@
               </w:rPr>
               <w:t xml:space="preserve">Quase todas as marcas que vendem à consumidora combinam site próprio com farmácias ou marketplaces. Sem canal oficial, a Naturys Eco tem </w:t>
             </w:r>
-            <w:hyperlink w:history="1" r:id="rIdybtyox9xfo1pvddx_2mrs">
+            <w:hyperlink w:history="1" r:id="rIdmh03hcbfh-5llm01uy-ur">
               <w:r>
                 <w:rPr>
                   <w:rFonts w:ascii="Montserrat" w:cs="Montserrat" w:eastAsia="Montserrat" w:hAnsi="Montserrat"/>
@@ -1970,7 +2020,7 @@
               </w:rPr>
               <w:t xml:space="preserve">Não encontramos assinatura nas quatro concorrentes. Lá fora, a Plus vendia com assinatura, segundo a </w:t>
             </w:r>
-            <w:hyperlink w:history="1" r:id="rIdizae6lzdt1rlrye0l4zdn">
+            <w:hyperlink w:history="1" r:id="rIdqtzhwwgzgrx_q6x30pkvg">
               <w:r>
                 <w:rPr>
                   <w:rFonts w:ascii="Montserrat" w:cs="Montserrat" w:eastAsia="Montserrat" w:hAnsi="Montserrat"/>
@@ -2198,7 +2248,32 @@
                 <w:sz w:val="19"/>
                 <w:szCs w:val="19"/>
               </w:rPr>
-              <w:t xml:space="preserve">Esse canal já compra sachê por menos de R$ 1. Depende de aceitarem pagar mais por um produto melhor</w:t>
+              <w:t xml:space="preserve">Esse canal já compra sachê por menos de R$ 1, como o da Naturallys, a R$ 0,25 na </w:t>
+            </w:r>
+            <w:hyperlink w:history="1" r:id="rId0_hjjieze9rkygm2op3k6">
+              <w:r>
+                <w:rPr>
+                  <w:rFonts w:ascii="Montserrat" w:cs="Montserrat" w:eastAsia="Montserrat" w:hAnsi="Montserrat"/>
+                  <w:b w:val="false"/>
+                  <w:bCs w:val="false"/>
+                  <w:color w:val="315CB6"/>
+                  <w:sz w:val="19"/>
+                  <w:szCs w:val="19"/>
+                  <w:u w:val="single"/>
+                </w:rPr>
+                <w:t xml:space="preserve">ParaHotel</w:t>
+              </w:r>
+            </w:hyperlink>
+            <w:r>
+              <w:rPr>
+                <w:rFonts w:ascii="Montserrat" w:cs="Montserrat" w:eastAsia="Montserrat" w:hAnsi="Montserrat"/>
+                <w:b w:val="false"/>
+                <w:bCs w:val="false"/>
+                <w:color w:val="262626"/>
+                <w:sz w:val="19"/>
+                <w:szCs w:val="19"/>
+              </w:rPr>
+              <w:t xml:space="preserve">. Depende de aceitarem pagar mais por um produto melhor</w:t>
             </w:r>
           </w:p>
         </w:tc>

</xml_diff>